<commit_message>
cajas chicas y recap
</commit_message>
<xml_diff>
--- a/docs/Preparacion_Prueba_Produccion.docx
+++ b/docs/Preparacion_Prueba_Produccion.docx
@@ -6355,6 +6355,135 @@
                 <w:sz w:val="19"/>
                 <w:szCs w:val="19"/>
               </w:rPr>
+              <w:t xml:space="preserve">Cajas chicas</w:t>
+            </w:r>
+          </w:p>
+        </w:tc>
+        <w:tc>
+          <w:tcPr>
+            <w:tcW w:type="dxa" w:w="2100"/>
+            <w:tcBorders>
+              <w:top w:val="single" w:color="CCCCCC" w:sz="1"/>
+              <w:left w:val="single" w:color="CCCCCC" w:sz="1"/>
+              <w:bottom w:val="single" w:color="CCCCCC" w:sz="1"/>
+              <w:right w:val="single" w:color="CCCCCC" w:sz="1"/>
+            </w:tcBorders>
+            <w:shd w:fill="F5F5F5" w:val="clear"/>
+            <w:tcMar>
+              <w:top w:type="dxa" w:w="80"/>
+              <w:left w:type="dxa" w:w="120"/>
+              <w:bottom w:type="dxa" w:w="80"/>
+              <w:right w:type="dxa" w:w="120"/>
+            </w:tcMar>
+          </w:tcPr>
+          <w:p>
+            <w:r>
+              <w:rPr>
+                <w:rFonts w:ascii="Arial" w:cs="Arial" w:eastAsia="Arial" w:hAnsi="Arial"/>
+                <w:b w:val="false"/>
+                <w:bCs w:val="false"/>
+                <w:color w:val="424242"/>
+                <w:sz w:val="19"/>
+                <w:szCs w:val="19"/>
+              </w:rPr>
+              <w:t xml:space="preserve">May o Male</w:t>
+            </w:r>
+          </w:p>
+        </w:tc>
+        <w:tc>
+          <w:tcPr>
+            <w:tcW w:type="dxa" w:w="3300"/>
+            <w:tcBorders>
+              <w:top w:val="single" w:color="CCCCCC" w:sz="1"/>
+              <w:left w:val="single" w:color="CCCCCC" w:sz="1"/>
+              <w:bottom w:val="single" w:color="CCCCCC" w:sz="1"/>
+              <w:right w:val="single" w:color="CCCCCC" w:sz="1"/>
+            </w:tcBorders>
+            <w:shd w:fill="F5F5F5" w:val="clear"/>
+            <w:tcMar>
+              <w:top w:type="dxa" w:w="80"/>
+              <w:left w:type="dxa" w:w="120"/>
+              <w:bottom w:type="dxa" w:w="80"/>
+              <w:right w:type="dxa" w:w="120"/>
+            </w:tcMar>
+          </w:tcPr>
+          <w:p>
+            <w:r>
+              <w:rPr>
+                <w:rFonts w:ascii="Arial" w:cs="Arial" w:eastAsia="Arial" w:hAnsi="Arial"/>
+                <w:b w:val="false"/>
+                <w:bCs w:val="false"/>
+                <w:color w:val="424242"/>
+                <w:sz w:val="19"/>
+                <w:szCs w:val="19"/>
+              </w:rPr>
+              <w:t xml:space="preserve">CAJAS 2026.xlsx</w:t>
+            </w:r>
+          </w:p>
+        </w:tc>
+        <w:tc>
+          <w:tcPr>
+            <w:tcW w:type="dxa" w:w="2680"/>
+            <w:tcBorders>
+              <w:top w:val="single" w:color="CCCCCC" w:sz="1"/>
+              <w:left w:val="single" w:color="CCCCCC" w:sz="1"/>
+              <w:bottom w:val="single" w:color="CCCCCC" w:sz="1"/>
+              <w:right w:val="single" w:color="CCCCCC" w:sz="1"/>
+            </w:tcBorders>
+            <w:shd w:fill="F5F5F5" w:val="clear"/>
+            <w:tcMar>
+              <w:top w:type="dxa" w:w="80"/>
+              <w:left w:type="dxa" w:w="120"/>
+              <w:bottom w:type="dxa" w:w="80"/>
+              <w:right w:type="dxa" w:w="120"/>
+            </w:tcMar>
+          </w:tcPr>
+          <w:p>
+            <w:r>
+              <w:rPr>
+                <w:rFonts w:ascii="Arial" w:cs="Arial" w:eastAsia="Arial" w:hAnsi="Arial"/>
+                <w:b w:val="false"/>
+                <w:bCs w:val="false"/>
+                <w:color w:val="424242"/>
+                <w:sz w:val="19"/>
+                <w:szCs w:val="19"/>
+              </w:rPr>
+              <w:t xml:space="preserve">Caja Global → Importar cajas chicas</w:t>
+            </w:r>
+          </w:p>
+        </w:tc>
+      </w:tr>
+      <w:tr>
+        <w:trPr>
+          <w:cantSplit/>
+        </w:trPr>
+        <w:tc>
+          <w:tcPr>
+            <w:tcW w:type="dxa" w:w="2000"/>
+            <w:tcBorders>
+              <w:top w:val="single" w:color="CCCCCC" w:sz="1"/>
+              <w:left w:val="single" w:color="CCCCCC" w:sz="1"/>
+              <w:bottom w:val="single" w:color="CCCCCC" w:sz="1"/>
+              <w:right w:val="single" w:color="CCCCCC" w:sz="1"/>
+            </w:tcBorders>
+            <w:shd w:fill="FFFFFF" w:val="clear"/>
+            <w:tcMar>
+              <w:top w:type="dxa" w:w="80"/>
+              <w:left w:type="dxa" w:w="120"/>
+              <w:bottom w:type="dxa" w:w="80"/>
+              <w:right w:type="dxa" w:w="120"/>
+            </w:tcMar>
+          </w:tcPr>
+          <w:p>
+            <w:r>
+              <w:rPr>
+                <w:rFonts w:ascii="Arial" w:cs="Arial" w:eastAsia="Arial" w:hAnsi="Arial"/>
+                <w:b/>
+                <w:bCs/>
+                <w:color w:val="1F4E79"/>
+                <w:sz w:val="19"/>
+                <w:szCs w:val="19"/>
+              </w:rPr>
               <w:t xml:space="preserve">Todos</w:t>
             </w:r>
           </w:p>
@@ -6368,7 +6497,7 @@
               <w:bottom w:val="single" w:color="CCCCCC" w:sz="1"/>
               <w:right w:val="single" w:color="CCCCCC" w:sz="1"/>
             </w:tcBorders>
-            <w:shd w:fill="F5F5F5" w:val="clear"/>
+            <w:shd w:fill="FFFFFF" w:val="clear"/>
             <w:tcMar>
               <w:top w:type="dxa" w:w="80"/>
               <w:left w:type="dxa" w:w="120"/>
@@ -6399,7 +6528,7 @@
               <w:bottom w:val="single" w:color="CCCCCC" w:sz="1"/>
               <w:right w:val="single" w:color="CCCCCC" w:sz="1"/>
             </w:tcBorders>
-            <w:shd w:fill="F5F5F5" w:val="clear"/>
+            <w:shd w:fill="FFFFFF" w:val="clear"/>
             <w:tcMar>
               <w:top w:type="dxa" w:w="80"/>
               <w:left w:type="dxa" w:w="120"/>
@@ -6430,7 +6559,7 @@
               <w:bottom w:val="single" w:color="CCCCCC" w:sz="1"/>
               <w:right w:val="single" w:color="CCCCCC" w:sz="1"/>
             </w:tcBorders>
-            <w:shd w:fill="F5F5F5" w:val="clear"/>
+            <w:shd w:fill="FFFFFF" w:val="clear"/>
             <w:tcMar>
               <w:top w:type="dxa" w:w="80"/>
               <w:left w:type="dxa" w:w="120"/>
@@ -9417,7 +9546,7 @@
           <w:sz w:val="21"/>
           <w:szCs w:val="21"/>
         </w:rPr>
-        <w:t xml:space="preserve">CAJAS 2026.xlsx (cajas de Dani, Male, Gus, Flor, Vicky y Mili por mes) no tiene importador todavía. Ver decisiones.</w:t>
+        <w:t xml:space="preserve">CAJAS 2026.xlsx se importa en Caja Global → Importar cajas chicas (May o Male): cada rendición (persona y mes) queda como una caja de efectivo cerrada, comparada contra su fila de totales. En la planilla actual son 38 rendiciones (diciembre 2025 a junio 2026, $ 18.147.080 de ingresos y $ 41.090.867,04 de gastos) y 8 bloques repetidos que no se importan (la hoja "todas" y "ENERO 2026", que repite la caja de Dani de diciembre). Una sola no cierra: Dani, abril 2026 (3), donde las filas suman $ 39.000 más que el total de la planilla. El bloque de la hoja OTRAS sin nombre (fila 22) hay que preguntar de quién es.</w:t>
       </w:r>
     </w:p>
     <w:p>
@@ -19673,7 +19802,7 @@
                 <w:sz w:val="19"/>
                 <w:szCs w:val="19"/>
               </w:rPr>
-              <w:t xml:space="preserve">CAJAS 2026.xlsx no tiene importador: decidir si las cajas chicas entran en la prueba.</w:t>
+              <w:t xml:space="preserve">Se importan como histórico (ver 3.4). En la parte 2, cada caja chica se abre en Caja Global y se carga ahí: confirmar con May quién la rinde y quién la cierra.</w:t>
             </w:r>
           </w:p>
         </w:tc>

</xml_diff>